<commit_message>
MI analysis done & Cox age setted to categorical
</commit_message>
<xml_diff>
--- a/output/tables/GEO/GSE39582/GSE39582_cox_OS_pMMR.docx
+++ b/output/tables/GEO/GSE39582/GSE39582_cox_OS_pMMR.docx
@@ -2600,62 +2600,62 @@
                 <w:szCs w:val="18"/>
                 <w:color w:val="000000"/>
               </w:rPr>
-              <w:t xml:space="preserve">0.76 (0.56–1.05)</w:t>
-            </w:r>
-          </w:p>
-        </w:tc>
-        <w:tc>
-          <w:tcPr>
-            <w:tcBorders>
-              <w:bottom w:val="none" w:sz="0" w:space="0" w:color="000000"/>
-              <w:top w:val="none" w:sz="0" w:space="0" w:color="000000"/>
-              <w:left w:val="none" w:sz="0" w:space="0" w:color="000000"/>
-              <w:right w:val="none" w:sz="0" w:space="0" w:color="000000"/>
-            </w:tcBorders>
-            <w:shd w:val="clear" w:color="auto" w:fill="FFFFFF"/>
-            <w:tcMar>
-              <w:top w:w="0" w:type="dxa"/>
-              <w:bottom w:w="0" w:type="dxa"/>
-              <w:left w:w="0" w:type="dxa"/>
-              <w:right w:w="0" w:type="dxa"/>
-            </w:tcMar>
-            <w:vAlign w:val="center"/>
-          </w:tcPr>
-          <w:p>
-            <w:pPr>
-              <w:pStyle w:val="Normal"/>
-              <w:jc w:val="left"/>
-              <w:pBdr>
-                <w:bottom w:val="none" w:sz="0" w:space="0" w:color="000000"/>
-                <w:top w:val="none" w:sz="0" w:space="0" w:color="000000"/>
-                <w:left w:val="none" w:sz="0" w:space="0" w:color="000000"/>
-                <w:right w:val="none" w:sz="0" w:space="0" w:color="000000"/>
-              </w:pBdr>
-              <w:spacing w:after="100" w:before="100" w:line="240"/>
-              <w:ind w:left="100" w:right="100" w:firstLine="0" w:firstLineChars="0"/>
-              <w:rPr>
-                <w:rFonts w:ascii="Times New Roman" w:hAnsi="Times New Roman" w:eastAsia="Times New Roman" w:cs="Times New Roman"/>
-                <w:i w:val="false"/>
-                <w:b w:val="false"/>
-                <w:u w:val="none"/>
-                <w:strike w:val="false"/>
-                <w:sz w:val="18"/>
-                <w:szCs w:val="18"/>
-                <w:color w:val="000000"/>
-              </w:rPr>
-            </w:pPr>
-            <w:r>
-              <w:rPr>
-                <w:rFonts w:ascii="Times New Roman" w:hAnsi="Times New Roman" w:eastAsia="Times New Roman" w:cs="Times New Roman"/>
-                <w:i w:val="false"/>
-                <w:b w:val="false"/>
-                <w:u w:val="none"/>
-                <w:strike w:val="false"/>
-                <w:sz w:val="18"/>
-                <w:szCs w:val="18"/>
-                <w:color w:val="000000"/>
-              </w:rPr>
-              <w:t xml:space="preserve">0.097</w:t>
+              <w:t xml:space="preserve">0.80 (0.58–1.10)</w:t>
+            </w:r>
+          </w:p>
+        </w:tc>
+        <w:tc>
+          <w:tcPr>
+            <w:tcBorders>
+              <w:bottom w:val="none" w:sz="0" w:space="0" w:color="000000"/>
+              <w:top w:val="none" w:sz="0" w:space="0" w:color="000000"/>
+              <w:left w:val="none" w:sz="0" w:space="0" w:color="000000"/>
+              <w:right w:val="none" w:sz="0" w:space="0" w:color="000000"/>
+            </w:tcBorders>
+            <w:shd w:val="clear" w:color="auto" w:fill="FFFFFF"/>
+            <w:tcMar>
+              <w:top w:w="0" w:type="dxa"/>
+              <w:bottom w:w="0" w:type="dxa"/>
+              <w:left w:w="0" w:type="dxa"/>
+              <w:right w:w="0" w:type="dxa"/>
+            </w:tcMar>
+            <w:vAlign w:val="center"/>
+          </w:tcPr>
+          <w:p>
+            <w:pPr>
+              <w:pStyle w:val="Normal"/>
+              <w:jc w:val="left"/>
+              <w:pBdr>
+                <w:bottom w:val="none" w:sz="0" w:space="0" w:color="000000"/>
+                <w:top w:val="none" w:sz="0" w:space="0" w:color="000000"/>
+                <w:left w:val="none" w:sz="0" w:space="0" w:color="000000"/>
+                <w:right w:val="none" w:sz="0" w:space="0" w:color="000000"/>
+              </w:pBdr>
+              <w:spacing w:after="100" w:before="100" w:line="240"/>
+              <w:ind w:left="100" w:right="100" w:firstLine="0" w:firstLineChars="0"/>
+              <w:rPr>
+                <w:rFonts w:ascii="Times New Roman" w:hAnsi="Times New Roman" w:eastAsia="Times New Roman" w:cs="Times New Roman"/>
+                <w:i w:val="false"/>
+                <w:b w:val="false"/>
+                <w:u w:val="none"/>
+                <w:strike w:val="false"/>
+                <w:sz w:val="18"/>
+                <w:szCs w:val="18"/>
+                <w:color w:val="000000"/>
+              </w:rPr>
+            </w:pPr>
+            <w:r>
+              <w:rPr>
+                <w:rFonts w:ascii="Times New Roman" w:hAnsi="Times New Roman" w:eastAsia="Times New Roman" w:cs="Times New Roman"/>
+                <w:i w:val="false"/>
+                <w:b w:val="false"/>
+                <w:u w:val="none"/>
+                <w:strike w:val="false"/>
+                <w:sz w:val="18"/>
+                <w:szCs w:val="18"/>
+                <w:color w:val="000000"/>
+              </w:rPr>
+              <w:t xml:space="preserve">0.166</w:t>
             </w:r>
           </w:p>
         </w:tc>
@@ -2825,7 +2825,227 @@
                 <w:szCs w:val="18"/>
                 <w:color w:val="000000"/>
               </w:rPr>
-              <w:t xml:space="preserve">Age (per 10 years)</w:t>
+              <w:t xml:space="preserve">Age group, years</w:t>
+            </w:r>
+          </w:p>
+        </w:tc>
+        <w:tc>
+          <w:tcPr>
+            <w:tcBorders>
+              <w:bottom w:val="none" w:sz="0" w:space="0" w:color="000000"/>
+              <w:top w:val="none" w:sz="0" w:space="0" w:color="000000"/>
+              <w:left w:val="none" w:sz="0" w:space="0" w:color="000000"/>
+              <w:right w:val="none" w:sz="0" w:space="0" w:color="000000"/>
+            </w:tcBorders>
+            <w:shd w:val="clear" w:color="auto" w:fill="FFFFFF"/>
+            <w:tcMar>
+              <w:top w:w="0" w:type="dxa"/>
+              <w:bottom w:w="0" w:type="dxa"/>
+              <w:left w:w="0" w:type="dxa"/>
+              <w:right w:w="0" w:type="dxa"/>
+            </w:tcMar>
+            <w:vAlign w:val="center"/>
+          </w:tcPr>
+          <w:p>
+            <w:pPr>
+              <w:pStyle w:val="Normal"/>
+              <w:jc w:val="left"/>
+              <w:pBdr>
+                <w:bottom w:val="none" w:sz="0" w:space="0" w:color="000000"/>
+                <w:top w:val="none" w:sz="0" w:space="0" w:color="000000"/>
+                <w:left w:val="none" w:sz="0" w:space="0" w:color="000000"/>
+                <w:right w:val="none" w:sz="0" w:space="0" w:color="000000"/>
+              </w:pBdr>
+              <w:spacing w:after="100" w:before="100" w:line="240"/>
+              <w:ind w:left="100" w:right="100" w:firstLine="0" w:firstLineChars="0"/>
+              <w:rPr>
+                <w:rFonts w:ascii="Times New Roman" w:hAnsi="Times New Roman" w:eastAsia="Times New Roman" w:cs="Times New Roman"/>
+                <w:i w:val="false"/>
+                <w:b w:val="false"/>
+                <w:u w:val="none"/>
+                <w:strike w:val="false"/>
+                <w:sz w:val="18"/>
+                <w:szCs w:val="18"/>
+                <w:color w:val="000000"/>
+              </w:rPr>
+            </w:pPr>
+            <w:r>
+              <w:rPr>
+                <w:rFonts w:ascii="Times New Roman" w:hAnsi="Times New Roman" w:eastAsia="Times New Roman" w:cs="Times New Roman"/>
+                <w:i w:val="false"/>
+                <w:b w:val="false"/>
+                <w:u w:val="none"/>
+                <w:strike w:val="false"/>
+                <w:sz w:val="18"/>
+                <w:szCs w:val="18"/>
+                <w:color w:val="000000"/>
+              </w:rPr>
+              <w:t xml:space="preserve">≤65 (ref)</w:t>
+            </w:r>
+          </w:p>
+        </w:tc>
+        <w:tc>
+          <w:tcPr>
+            <w:tcBorders>
+              <w:bottom w:val="none" w:sz="0" w:space="0" w:color="000000"/>
+              <w:top w:val="none" w:sz="0" w:space="0" w:color="000000"/>
+              <w:left w:val="none" w:sz="0" w:space="0" w:color="000000"/>
+              <w:right w:val="none" w:sz="0" w:space="0" w:color="000000"/>
+            </w:tcBorders>
+            <w:shd w:val="clear" w:color="auto" w:fill="FFFFFF"/>
+            <w:tcMar>
+              <w:top w:w="0" w:type="dxa"/>
+              <w:bottom w:w="0" w:type="dxa"/>
+              <w:left w:w="0" w:type="dxa"/>
+              <w:right w:w="0" w:type="dxa"/>
+            </w:tcMar>
+            <w:vAlign w:val="center"/>
+          </w:tcPr>
+          <w:p>
+            <w:pPr>
+              <w:pStyle w:val="Normal"/>
+              <w:jc w:val="right"/>
+              <w:pBdr>
+                <w:bottom w:val="none" w:sz="0" w:space="0" w:color="000000"/>
+                <w:top w:val="none" w:sz="0" w:space="0" w:color="000000"/>
+                <w:left w:val="none" w:sz="0" w:space="0" w:color="000000"/>
+                <w:right w:val="none" w:sz="0" w:space="0" w:color="000000"/>
+              </w:pBdr>
+              <w:spacing w:after="100" w:before="100" w:line="240"/>
+              <w:ind w:left="100" w:right="100" w:firstLine="0" w:firstLineChars="0"/>
+              <w:rPr>
+                <w:rFonts w:ascii="Times New Roman" w:hAnsi="Times New Roman" w:eastAsia="Times New Roman" w:cs="Times New Roman"/>
+                <w:i w:val="false"/>
+                <w:b w:val="false"/>
+                <w:u w:val="none"/>
+                <w:strike w:val="false"/>
+                <w:sz w:val="18"/>
+                <w:szCs w:val="18"/>
+                <w:color w:val="000000"/>
+              </w:rPr>
+            </w:pPr>
+            <w:r>
+              <w:rPr>
+                <w:rFonts w:ascii="Times New Roman" w:hAnsi="Times New Roman" w:eastAsia="Times New Roman" w:cs="Times New Roman"/>
+                <w:i w:val="false"/>
+                <w:b w:val="false"/>
+                <w:u w:val="none"/>
+                <w:strike w:val="false"/>
+                <w:sz w:val="18"/>
+                <w:szCs w:val="18"/>
+                <w:color w:val="000000"/>
+              </w:rPr>
+              <w:t xml:space="preserve">183</w:t>
+            </w:r>
+          </w:p>
+        </w:tc>
+        <w:tc>
+          <w:tcPr>
+            <w:tcBorders>
+              <w:bottom w:val="none" w:sz="0" w:space="0" w:color="000000"/>
+              <w:top w:val="none" w:sz="0" w:space="0" w:color="000000"/>
+              <w:left w:val="none" w:sz="0" w:space="0" w:color="000000"/>
+              <w:right w:val="none" w:sz="0" w:space="0" w:color="000000"/>
+            </w:tcBorders>
+            <w:shd w:val="clear" w:color="auto" w:fill="FFFFFF"/>
+            <w:tcMar>
+              <w:top w:w="0" w:type="dxa"/>
+              <w:bottom w:w="0" w:type="dxa"/>
+              <w:left w:w="0" w:type="dxa"/>
+              <w:right w:w="0" w:type="dxa"/>
+            </w:tcMar>
+            <w:vAlign w:val="center"/>
+          </w:tcPr>
+          <w:p>
+            <w:pPr>
+              <w:pStyle w:val="Normal"/>
+              <w:jc w:val="right"/>
+              <w:pBdr>
+                <w:bottom w:val="none" w:sz="0" w:space="0" w:color="000000"/>
+                <w:top w:val="none" w:sz="0" w:space="0" w:color="000000"/>
+                <w:left w:val="none" w:sz="0" w:space="0" w:color="000000"/>
+                <w:right w:val="none" w:sz="0" w:space="0" w:color="000000"/>
+              </w:pBdr>
+              <w:spacing w:after="100" w:before="100" w:line="240"/>
+              <w:ind w:left="100" w:right="100" w:firstLine="0" w:firstLineChars="0"/>
+              <w:rPr>
+                <w:rFonts w:ascii="Times New Roman" w:hAnsi="Times New Roman" w:eastAsia="Times New Roman" w:cs="Times New Roman"/>
+                <w:i w:val="false"/>
+                <w:b w:val="false"/>
+                <w:u w:val="none"/>
+                <w:strike w:val="false"/>
+                <w:sz w:val="18"/>
+                <w:szCs w:val="18"/>
+                <w:color w:val="000000"/>
+              </w:rPr>
+            </w:pPr>
+            <w:r>
+              <w:rPr>
+                <w:rFonts w:ascii="Times New Roman" w:hAnsi="Times New Roman" w:eastAsia="Times New Roman" w:cs="Times New Roman"/>
+                <w:i w:val="false"/>
+                <w:b w:val="false"/>
+                <w:u w:val="none"/>
+                <w:strike w:val="false"/>
+                <w:sz w:val="18"/>
+                <w:szCs w:val="18"/>
+                <w:color w:val="000000"/>
+              </w:rPr>
+              <w:t xml:space="preserve">54</w:t>
+            </w:r>
+          </w:p>
+        </w:tc>
+        <w:tc>
+          <w:tcPr>
+            <w:tcBorders>
+              <w:bottom w:val="none" w:sz="0" w:space="0" w:color="000000"/>
+              <w:top w:val="none" w:sz="0" w:space="0" w:color="000000"/>
+              <w:left w:val="none" w:sz="0" w:space="0" w:color="000000"/>
+              <w:right w:val="none" w:sz="0" w:space="0" w:color="000000"/>
+            </w:tcBorders>
+            <w:shd w:val="clear" w:color="auto" w:fill="FFFFFF"/>
+            <w:tcMar>
+              <w:top w:w="0" w:type="dxa"/>
+              <w:bottom w:w="0" w:type="dxa"/>
+              <w:left w:w="0" w:type="dxa"/>
+              <w:right w:w="0" w:type="dxa"/>
+            </w:tcMar>
+            <w:vAlign w:val="center"/>
+          </w:tcPr>
+          <w:p>
+            <w:pPr>
+              <w:pStyle w:val="Normal"/>
+              <w:jc w:val="left"/>
+              <w:pBdr>
+                <w:bottom w:val="none" w:sz="0" w:space="0" w:color="000000"/>
+                <w:top w:val="none" w:sz="0" w:space="0" w:color="000000"/>
+                <w:left w:val="none" w:sz="0" w:space="0" w:color="000000"/>
+                <w:right w:val="none" w:sz="0" w:space="0" w:color="000000"/>
+              </w:pBdr>
+              <w:spacing w:after="100" w:before="100" w:line="240"/>
+              <w:ind w:left="100" w:right="100" w:firstLine="0" w:firstLineChars="0"/>
+              <w:rPr>
+                <w:rFonts w:ascii="Times New Roman" w:hAnsi="Times New Roman" w:eastAsia="Times New Roman" w:cs="Times New Roman"/>
+                <w:i w:val="false"/>
+                <w:b w:val="false"/>
+                <w:u w:val="none"/>
+                <w:strike w:val="false"/>
+                <w:sz w:val="18"/>
+                <w:szCs w:val="18"/>
+                <w:color w:val="000000"/>
+              </w:rPr>
+            </w:pPr>
+            <w:r>
+              <w:rPr>
+                <w:rFonts w:ascii="Times New Roman" w:hAnsi="Times New Roman" w:eastAsia="Times New Roman" w:cs="Times New Roman"/>
+                <w:i w:val="false"/>
+                <w:b w:val="false"/>
+                <w:u w:val="none"/>
+                <w:strike w:val="false"/>
+                <w:sz w:val="18"/>
+                <w:szCs w:val="18"/>
+                <w:color w:val="000000"/>
+              </w:rPr>
+              <w:t xml:space="preserve">Reference</w:t>
             </w:r>
           </w:p>
         </w:tc>
@@ -2881,226 +3101,6 @@
                 <w:color w:val="000000"/>
               </w:rPr>
               <w:t xml:space="preserve"/>
-            </w:r>
-          </w:p>
-        </w:tc>
-        <w:tc>
-          <w:tcPr>
-            <w:tcBorders>
-              <w:bottom w:val="none" w:sz="0" w:space="0" w:color="000000"/>
-              <w:top w:val="none" w:sz="0" w:space="0" w:color="000000"/>
-              <w:left w:val="none" w:sz="0" w:space="0" w:color="000000"/>
-              <w:right w:val="none" w:sz="0" w:space="0" w:color="000000"/>
-            </w:tcBorders>
-            <w:shd w:val="clear" w:color="auto" w:fill="FFFFFF"/>
-            <w:tcMar>
-              <w:top w:w="0" w:type="dxa"/>
-              <w:bottom w:w="0" w:type="dxa"/>
-              <w:left w:w="0" w:type="dxa"/>
-              <w:right w:w="0" w:type="dxa"/>
-            </w:tcMar>
-            <w:vAlign w:val="center"/>
-          </w:tcPr>
-          <w:p>
-            <w:pPr>
-              <w:pStyle w:val="Normal"/>
-              <w:jc w:val="right"/>
-              <w:pBdr>
-                <w:bottom w:val="none" w:sz="0" w:space="0" w:color="000000"/>
-                <w:top w:val="none" w:sz="0" w:space="0" w:color="000000"/>
-                <w:left w:val="none" w:sz="0" w:space="0" w:color="000000"/>
-                <w:right w:val="none" w:sz="0" w:space="0" w:color="000000"/>
-              </w:pBdr>
-              <w:spacing w:after="100" w:before="100" w:line="240"/>
-              <w:ind w:left="100" w:right="100" w:firstLine="0" w:firstLineChars="0"/>
-              <w:rPr>
-                <w:rFonts w:ascii="Times New Roman" w:hAnsi="Times New Roman" w:eastAsia="Times New Roman" w:cs="Times New Roman"/>
-                <w:i w:val="false"/>
-                <w:b w:val="false"/>
-                <w:u w:val="none"/>
-                <w:strike w:val="false"/>
-                <w:sz w:val="18"/>
-                <w:szCs w:val="18"/>
-                <w:color w:val="000000"/>
-              </w:rPr>
-            </w:pPr>
-            <w:r>
-              <w:rPr>
-                <w:rFonts w:ascii="Times New Roman" w:hAnsi="Times New Roman" w:eastAsia="Times New Roman" w:cs="Times New Roman"/>
-                <w:i w:val="false"/>
-                <w:b w:val="false"/>
-                <w:u w:val="none"/>
-                <w:strike w:val="false"/>
-                <w:sz w:val="18"/>
-                <w:szCs w:val="18"/>
-                <w:color w:val="000000"/>
-              </w:rPr>
-              <w:t xml:space="preserve">440</w:t>
-            </w:r>
-          </w:p>
-        </w:tc>
-        <w:tc>
-          <w:tcPr>
-            <w:tcBorders>
-              <w:bottom w:val="none" w:sz="0" w:space="0" w:color="000000"/>
-              <w:top w:val="none" w:sz="0" w:space="0" w:color="000000"/>
-              <w:left w:val="none" w:sz="0" w:space="0" w:color="000000"/>
-              <w:right w:val="none" w:sz="0" w:space="0" w:color="000000"/>
-            </w:tcBorders>
-            <w:shd w:val="clear" w:color="auto" w:fill="FFFFFF"/>
-            <w:tcMar>
-              <w:top w:w="0" w:type="dxa"/>
-              <w:bottom w:w="0" w:type="dxa"/>
-              <w:left w:w="0" w:type="dxa"/>
-              <w:right w:w="0" w:type="dxa"/>
-            </w:tcMar>
-            <w:vAlign w:val="center"/>
-          </w:tcPr>
-          <w:p>
-            <w:pPr>
-              <w:pStyle w:val="Normal"/>
-              <w:jc w:val="right"/>
-              <w:pBdr>
-                <w:bottom w:val="none" w:sz="0" w:space="0" w:color="000000"/>
-                <w:top w:val="none" w:sz="0" w:space="0" w:color="000000"/>
-                <w:left w:val="none" w:sz="0" w:space="0" w:color="000000"/>
-                <w:right w:val="none" w:sz="0" w:space="0" w:color="000000"/>
-              </w:pBdr>
-              <w:spacing w:after="100" w:before="100" w:line="240"/>
-              <w:ind w:left="100" w:right="100" w:firstLine="0" w:firstLineChars="0"/>
-              <w:rPr>
-                <w:rFonts w:ascii="Times New Roman" w:hAnsi="Times New Roman" w:eastAsia="Times New Roman" w:cs="Times New Roman"/>
-                <w:i w:val="false"/>
-                <w:b w:val="false"/>
-                <w:u w:val="none"/>
-                <w:strike w:val="false"/>
-                <w:sz w:val="18"/>
-                <w:szCs w:val="18"/>
-                <w:color w:val="000000"/>
-              </w:rPr>
-            </w:pPr>
-            <w:r>
-              <w:rPr>
-                <w:rFonts w:ascii="Times New Roman" w:hAnsi="Times New Roman" w:eastAsia="Times New Roman" w:cs="Times New Roman"/>
-                <w:i w:val="false"/>
-                <w:b w:val="false"/>
-                <w:u w:val="none"/>
-                <w:strike w:val="false"/>
-                <w:sz w:val="18"/>
-                <w:szCs w:val="18"/>
-                <w:color w:val="000000"/>
-              </w:rPr>
-              <w:t xml:space="preserve">157</w:t>
-            </w:r>
-          </w:p>
-        </w:tc>
-        <w:tc>
-          <w:tcPr>
-            <w:tcBorders>
-              <w:bottom w:val="none" w:sz="0" w:space="0" w:color="000000"/>
-              <w:top w:val="none" w:sz="0" w:space="0" w:color="000000"/>
-              <w:left w:val="none" w:sz="0" w:space="0" w:color="000000"/>
-              <w:right w:val="none" w:sz="0" w:space="0" w:color="000000"/>
-            </w:tcBorders>
-            <w:shd w:val="clear" w:color="auto" w:fill="FFFFFF"/>
-            <w:tcMar>
-              <w:top w:w="0" w:type="dxa"/>
-              <w:bottom w:w="0" w:type="dxa"/>
-              <w:left w:w="0" w:type="dxa"/>
-              <w:right w:w="0" w:type="dxa"/>
-            </w:tcMar>
-            <w:vAlign w:val="center"/>
-          </w:tcPr>
-          <w:p>
-            <w:pPr>
-              <w:pStyle w:val="Normal"/>
-              <w:jc w:val="left"/>
-              <w:pBdr>
-                <w:bottom w:val="none" w:sz="0" w:space="0" w:color="000000"/>
-                <w:top w:val="none" w:sz="0" w:space="0" w:color="000000"/>
-                <w:left w:val="none" w:sz="0" w:space="0" w:color="000000"/>
-                <w:right w:val="none" w:sz="0" w:space="0" w:color="000000"/>
-              </w:pBdr>
-              <w:spacing w:after="100" w:before="100" w:line="240"/>
-              <w:ind w:left="100" w:right="100" w:firstLine="0" w:firstLineChars="0"/>
-              <w:rPr>
-                <w:rFonts w:ascii="Times New Roman" w:hAnsi="Times New Roman" w:eastAsia="Times New Roman" w:cs="Times New Roman"/>
-                <w:i w:val="false"/>
-                <w:b w:val="false"/>
-                <w:u w:val="none"/>
-                <w:strike w:val="false"/>
-                <w:sz w:val="18"/>
-                <w:szCs w:val="18"/>
-                <w:color w:val="000000"/>
-              </w:rPr>
-            </w:pPr>
-            <w:r>
-              <w:rPr>
-                <w:rFonts w:ascii="Times New Roman" w:hAnsi="Times New Roman" w:eastAsia="Times New Roman" w:cs="Times New Roman"/>
-                <w:i w:val="false"/>
-                <w:b w:val="false"/>
-                <w:u w:val="none"/>
-                <w:strike w:val="false"/>
-                <w:sz w:val="18"/>
-                <w:szCs w:val="18"/>
-                <w:color w:val="000000"/>
-              </w:rPr>
-              <w:t xml:space="preserve">1.03 (1.01–1.04)</w:t>
-            </w:r>
-          </w:p>
-        </w:tc>
-        <w:tc>
-          <w:tcPr>
-            <w:tcBorders>
-              <w:bottom w:val="none" w:sz="0" w:space="0" w:color="000000"/>
-              <w:top w:val="none" w:sz="0" w:space="0" w:color="000000"/>
-              <w:left w:val="none" w:sz="0" w:space="0" w:color="000000"/>
-              <w:right w:val="none" w:sz="0" w:space="0" w:color="000000"/>
-            </w:tcBorders>
-            <w:shd w:val="clear" w:color="auto" w:fill="FFFFFF"/>
-            <w:tcMar>
-              <w:top w:w="0" w:type="dxa"/>
-              <w:bottom w:w="0" w:type="dxa"/>
-              <w:left w:w="0" w:type="dxa"/>
-              <w:right w:w="0" w:type="dxa"/>
-            </w:tcMar>
-            <w:vAlign w:val="center"/>
-          </w:tcPr>
-          <w:p>
-            <w:pPr>
-              <w:pStyle w:val="Normal"/>
-              <w:jc w:val="left"/>
-              <w:pBdr>
-                <w:bottom w:val="none" w:sz="0" w:space="0" w:color="000000"/>
-                <w:top w:val="none" w:sz="0" w:space="0" w:color="000000"/>
-                <w:left w:val="none" w:sz="0" w:space="0" w:color="000000"/>
-                <w:right w:val="none" w:sz="0" w:space="0" w:color="000000"/>
-              </w:pBdr>
-              <w:spacing w:after="100" w:before="100" w:line="240"/>
-              <w:ind w:left="100" w:right="100" w:firstLine="0" w:firstLineChars="0"/>
-              <w:rPr>
-                <w:rFonts w:ascii="Times New Roman" w:hAnsi="Times New Roman" w:eastAsia="Times New Roman" w:cs="Times New Roman"/>
-                <w:i w:val="false"/>
-                <w:b w:val="false"/>
-                <w:u w:val="none"/>
-                <w:strike w:val="false"/>
-                <w:sz w:val="18"/>
-                <w:szCs w:val="18"/>
-                <w:color w:val="000000"/>
-              </w:rPr>
-            </w:pPr>
-            <w:r>
-              <w:rPr>
-                <w:rFonts w:ascii="Times New Roman" w:hAnsi="Times New Roman" w:eastAsia="Times New Roman" w:cs="Times New Roman"/>
-                <w:i w:val="false"/>
-                <w:b w:val="false"/>
-                <w:u w:val="none"/>
-                <w:strike w:val="false"/>
-                <w:sz w:val="18"/>
-                <w:szCs w:val="18"/>
-                <w:color w:val="000000"/>
-              </w:rPr>
-              <w:t xml:space="preserve">&lt;0.001</w:t>
             </w:r>
           </w:p>
         </w:tc>
@@ -3270,62 +3270,62 @@
                 <w:szCs w:val="18"/>
                 <w:color w:val="000000"/>
               </w:rPr>
-              <w:t xml:space="preserve">Sex</w:t>
-            </w:r>
-          </w:p>
-        </w:tc>
-        <w:tc>
-          <w:tcPr>
-            <w:tcBorders>
-              <w:bottom w:val="none" w:sz="0" w:space="0" w:color="000000"/>
-              <w:top w:val="none" w:sz="0" w:space="0" w:color="000000"/>
-              <w:left w:val="none" w:sz="0" w:space="0" w:color="000000"/>
-              <w:right w:val="none" w:sz="0" w:space="0" w:color="000000"/>
-            </w:tcBorders>
-            <w:shd w:val="clear" w:color="auto" w:fill="FFFFFF"/>
-            <w:tcMar>
-              <w:top w:w="0" w:type="dxa"/>
-              <w:bottom w:w="0" w:type="dxa"/>
-              <w:left w:w="0" w:type="dxa"/>
-              <w:right w:w="0" w:type="dxa"/>
-            </w:tcMar>
-            <w:vAlign w:val="center"/>
-          </w:tcPr>
-          <w:p>
-            <w:pPr>
-              <w:pStyle w:val="Normal"/>
-              <w:jc w:val="left"/>
-              <w:pBdr>
-                <w:bottom w:val="none" w:sz="0" w:space="0" w:color="000000"/>
-                <w:top w:val="none" w:sz="0" w:space="0" w:color="000000"/>
-                <w:left w:val="none" w:sz="0" w:space="0" w:color="000000"/>
-                <w:right w:val="none" w:sz="0" w:space="0" w:color="000000"/>
-              </w:pBdr>
-              <w:spacing w:after="100" w:before="100" w:line="240"/>
-              <w:ind w:left="100" w:right="100" w:firstLine="0" w:firstLineChars="0"/>
-              <w:rPr>
-                <w:rFonts w:ascii="Times New Roman" w:hAnsi="Times New Roman" w:eastAsia="Times New Roman" w:cs="Times New Roman"/>
-                <w:i w:val="false"/>
-                <w:b w:val="false"/>
-                <w:u w:val="none"/>
-                <w:strike w:val="false"/>
-                <w:sz w:val="18"/>
-                <w:szCs w:val="18"/>
-                <w:color w:val="000000"/>
-              </w:rPr>
-            </w:pPr>
-            <w:r>
-              <w:rPr>
-                <w:rFonts w:ascii="Times New Roman" w:hAnsi="Times New Roman" w:eastAsia="Times New Roman" w:cs="Times New Roman"/>
-                <w:i w:val="false"/>
-                <w:b w:val="false"/>
-                <w:u w:val="none"/>
-                <w:strike w:val="false"/>
-                <w:sz w:val="18"/>
-                <w:szCs w:val="18"/>
-                <w:color w:val="000000"/>
-              </w:rPr>
-              <w:t xml:space="preserve">Male (ref)</w:t>
+              <w:t xml:space="preserve"/>
+            </w:r>
+          </w:p>
+        </w:tc>
+        <w:tc>
+          <w:tcPr>
+            <w:tcBorders>
+              <w:bottom w:val="none" w:sz="0" w:space="0" w:color="000000"/>
+              <w:top w:val="none" w:sz="0" w:space="0" w:color="000000"/>
+              <w:left w:val="none" w:sz="0" w:space="0" w:color="000000"/>
+              <w:right w:val="none" w:sz="0" w:space="0" w:color="000000"/>
+            </w:tcBorders>
+            <w:shd w:val="clear" w:color="auto" w:fill="FFFFFF"/>
+            <w:tcMar>
+              <w:top w:w="0" w:type="dxa"/>
+              <w:bottom w:w="0" w:type="dxa"/>
+              <w:left w:w="0" w:type="dxa"/>
+              <w:right w:w="0" w:type="dxa"/>
+            </w:tcMar>
+            <w:vAlign w:val="center"/>
+          </w:tcPr>
+          <w:p>
+            <w:pPr>
+              <w:pStyle w:val="Normal"/>
+              <w:jc w:val="left"/>
+              <w:pBdr>
+                <w:bottom w:val="none" w:sz="0" w:space="0" w:color="000000"/>
+                <w:top w:val="none" w:sz="0" w:space="0" w:color="000000"/>
+                <w:left w:val="none" w:sz="0" w:space="0" w:color="000000"/>
+                <w:right w:val="none" w:sz="0" w:space="0" w:color="000000"/>
+              </w:pBdr>
+              <w:spacing w:after="100" w:before="100" w:line="240"/>
+              <w:ind w:left="100" w:right="100" w:firstLine="0" w:firstLineChars="0"/>
+              <w:rPr>
+                <w:rFonts w:ascii="Times New Roman" w:hAnsi="Times New Roman" w:eastAsia="Times New Roman" w:cs="Times New Roman"/>
+                <w:i w:val="false"/>
+                <w:b w:val="false"/>
+                <w:u w:val="none"/>
+                <w:strike w:val="false"/>
+                <w:sz w:val="18"/>
+                <w:szCs w:val="18"/>
+                <w:color w:val="000000"/>
+              </w:rPr>
+            </w:pPr>
+            <w:r>
+              <w:rPr>
+                <w:rFonts w:ascii="Times New Roman" w:hAnsi="Times New Roman" w:eastAsia="Times New Roman" w:cs="Times New Roman"/>
+                <w:i w:val="false"/>
+                <w:b w:val="false"/>
+                <w:u w:val="none"/>
+                <w:strike w:val="false"/>
+                <w:sz w:val="18"/>
+                <w:szCs w:val="18"/>
+                <w:color w:val="000000"/>
+              </w:rPr>
+              <w:t xml:space="preserve">&gt;65</w:t>
             </w:r>
           </w:p>
         </w:tc>
@@ -3380,7 +3380,7 @@
                 <w:szCs w:val="18"/>
                 <w:color w:val="000000"/>
               </w:rPr>
-              <w:t xml:space="preserve">249</w:t>
+              <w:t xml:space="preserve">257</w:t>
             </w:r>
           </w:p>
         </w:tc>
@@ -3435,117 +3435,117 @@
                 <w:szCs w:val="18"/>
                 <w:color w:val="000000"/>
               </w:rPr>
-              <w:t xml:space="preserve">92</w:t>
-            </w:r>
-          </w:p>
-        </w:tc>
-        <w:tc>
-          <w:tcPr>
-            <w:tcBorders>
-              <w:bottom w:val="none" w:sz="0" w:space="0" w:color="000000"/>
-              <w:top w:val="none" w:sz="0" w:space="0" w:color="000000"/>
-              <w:left w:val="none" w:sz="0" w:space="0" w:color="000000"/>
-              <w:right w:val="none" w:sz="0" w:space="0" w:color="000000"/>
-            </w:tcBorders>
-            <w:shd w:val="clear" w:color="auto" w:fill="FFFFFF"/>
-            <w:tcMar>
-              <w:top w:w="0" w:type="dxa"/>
-              <w:bottom w:w="0" w:type="dxa"/>
-              <w:left w:w="0" w:type="dxa"/>
-              <w:right w:w="0" w:type="dxa"/>
-            </w:tcMar>
-            <w:vAlign w:val="center"/>
-          </w:tcPr>
-          <w:p>
-            <w:pPr>
-              <w:pStyle w:val="Normal"/>
-              <w:jc w:val="left"/>
-              <w:pBdr>
-                <w:bottom w:val="none" w:sz="0" w:space="0" w:color="000000"/>
-                <w:top w:val="none" w:sz="0" w:space="0" w:color="000000"/>
-                <w:left w:val="none" w:sz="0" w:space="0" w:color="000000"/>
-                <w:right w:val="none" w:sz="0" w:space="0" w:color="000000"/>
-              </w:pBdr>
-              <w:spacing w:after="100" w:before="100" w:line="240"/>
-              <w:ind w:left="100" w:right="100" w:firstLine="0" w:firstLineChars="0"/>
-              <w:rPr>
-                <w:rFonts w:ascii="Times New Roman" w:hAnsi="Times New Roman" w:eastAsia="Times New Roman" w:cs="Times New Roman"/>
-                <w:i w:val="false"/>
-                <w:b w:val="false"/>
-                <w:u w:val="none"/>
-                <w:strike w:val="false"/>
-                <w:sz w:val="18"/>
-                <w:szCs w:val="18"/>
-                <w:color w:val="000000"/>
-              </w:rPr>
-            </w:pPr>
-            <w:r>
-              <w:rPr>
-                <w:rFonts w:ascii="Times New Roman" w:hAnsi="Times New Roman" w:eastAsia="Times New Roman" w:cs="Times New Roman"/>
-                <w:i w:val="false"/>
-                <w:b w:val="false"/>
-                <w:u w:val="none"/>
-                <w:strike w:val="false"/>
-                <w:sz w:val="18"/>
-                <w:szCs w:val="18"/>
-                <w:color w:val="000000"/>
-              </w:rPr>
-              <w:t xml:space="preserve">Reference</w:t>
-            </w:r>
-          </w:p>
-        </w:tc>
-        <w:tc>
-          <w:tcPr>
-            <w:tcBorders>
-              <w:bottom w:val="none" w:sz="0" w:space="0" w:color="000000"/>
-              <w:top w:val="none" w:sz="0" w:space="0" w:color="000000"/>
-              <w:left w:val="none" w:sz="0" w:space="0" w:color="000000"/>
-              <w:right w:val="none" w:sz="0" w:space="0" w:color="000000"/>
-            </w:tcBorders>
-            <w:shd w:val="clear" w:color="auto" w:fill="FFFFFF"/>
-            <w:tcMar>
-              <w:top w:w="0" w:type="dxa"/>
-              <w:bottom w:w="0" w:type="dxa"/>
-              <w:left w:w="0" w:type="dxa"/>
-              <w:right w:w="0" w:type="dxa"/>
-            </w:tcMar>
-            <w:vAlign w:val="center"/>
-          </w:tcPr>
-          <w:p>
-            <w:pPr>
-              <w:pStyle w:val="Normal"/>
-              <w:jc w:val="left"/>
-              <w:pBdr>
-                <w:bottom w:val="none" w:sz="0" w:space="0" w:color="000000"/>
-                <w:top w:val="none" w:sz="0" w:space="0" w:color="000000"/>
-                <w:left w:val="none" w:sz="0" w:space="0" w:color="000000"/>
-                <w:right w:val="none" w:sz="0" w:space="0" w:color="000000"/>
-              </w:pBdr>
-              <w:spacing w:after="100" w:before="100" w:line="240"/>
-              <w:ind w:left="100" w:right="100" w:firstLine="0" w:firstLineChars="0"/>
-              <w:rPr>
-                <w:rFonts w:ascii="Times New Roman" w:hAnsi="Times New Roman" w:eastAsia="Times New Roman" w:cs="Times New Roman"/>
-                <w:i w:val="false"/>
-                <w:b w:val="false"/>
-                <w:u w:val="none"/>
-                <w:strike w:val="false"/>
-                <w:sz w:val="18"/>
-                <w:szCs w:val="18"/>
-                <w:color w:val="000000"/>
-              </w:rPr>
-            </w:pPr>
-            <w:r>
-              <w:rPr>
-                <w:rFonts w:ascii="Times New Roman" w:hAnsi="Times New Roman" w:eastAsia="Times New Roman" w:cs="Times New Roman"/>
-                <w:i w:val="false"/>
-                <w:b w:val="false"/>
-                <w:u w:val="none"/>
-                <w:strike w:val="false"/>
-                <w:sz w:val="18"/>
-                <w:szCs w:val="18"/>
-                <w:color w:val="000000"/>
-              </w:rPr>
-              <w:t xml:space="preserve"/>
+              <w:t xml:space="preserve">103</w:t>
+            </w:r>
+          </w:p>
+        </w:tc>
+        <w:tc>
+          <w:tcPr>
+            <w:tcBorders>
+              <w:bottom w:val="none" w:sz="0" w:space="0" w:color="000000"/>
+              <w:top w:val="none" w:sz="0" w:space="0" w:color="000000"/>
+              <w:left w:val="none" w:sz="0" w:space="0" w:color="000000"/>
+              <w:right w:val="none" w:sz="0" w:space="0" w:color="000000"/>
+            </w:tcBorders>
+            <w:shd w:val="clear" w:color="auto" w:fill="FFFFFF"/>
+            <w:tcMar>
+              <w:top w:w="0" w:type="dxa"/>
+              <w:bottom w:w="0" w:type="dxa"/>
+              <w:left w:w="0" w:type="dxa"/>
+              <w:right w:w="0" w:type="dxa"/>
+            </w:tcMar>
+            <w:vAlign w:val="center"/>
+          </w:tcPr>
+          <w:p>
+            <w:pPr>
+              <w:pStyle w:val="Normal"/>
+              <w:jc w:val="left"/>
+              <w:pBdr>
+                <w:bottom w:val="none" w:sz="0" w:space="0" w:color="000000"/>
+                <w:top w:val="none" w:sz="0" w:space="0" w:color="000000"/>
+                <w:left w:val="none" w:sz="0" w:space="0" w:color="000000"/>
+                <w:right w:val="none" w:sz="0" w:space="0" w:color="000000"/>
+              </w:pBdr>
+              <w:spacing w:after="100" w:before="100" w:line="240"/>
+              <w:ind w:left="100" w:right="100" w:firstLine="0" w:firstLineChars="0"/>
+              <w:rPr>
+                <w:rFonts w:ascii="Times New Roman" w:hAnsi="Times New Roman" w:eastAsia="Times New Roman" w:cs="Times New Roman"/>
+                <w:i w:val="false"/>
+                <w:b w:val="false"/>
+                <w:u w:val="none"/>
+                <w:strike w:val="false"/>
+                <w:sz w:val="18"/>
+                <w:szCs w:val="18"/>
+                <w:color w:val="000000"/>
+              </w:rPr>
+            </w:pPr>
+            <w:r>
+              <w:rPr>
+                <w:rFonts w:ascii="Times New Roman" w:hAnsi="Times New Roman" w:eastAsia="Times New Roman" w:cs="Times New Roman"/>
+                <w:i w:val="false"/>
+                <w:b w:val="false"/>
+                <w:u w:val="none"/>
+                <w:strike w:val="false"/>
+                <w:sz w:val="18"/>
+                <w:szCs w:val="18"/>
+                <w:color w:val="000000"/>
+              </w:rPr>
+              <w:t xml:space="preserve">1.61 (1.16–2.24)</w:t>
+            </w:r>
+          </w:p>
+        </w:tc>
+        <w:tc>
+          <w:tcPr>
+            <w:tcBorders>
+              <w:bottom w:val="none" w:sz="0" w:space="0" w:color="000000"/>
+              <w:top w:val="none" w:sz="0" w:space="0" w:color="000000"/>
+              <w:left w:val="none" w:sz="0" w:space="0" w:color="000000"/>
+              <w:right w:val="none" w:sz="0" w:space="0" w:color="000000"/>
+            </w:tcBorders>
+            <w:shd w:val="clear" w:color="auto" w:fill="FFFFFF"/>
+            <w:tcMar>
+              <w:top w:w="0" w:type="dxa"/>
+              <w:bottom w:w="0" w:type="dxa"/>
+              <w:left w:w="0" w:type="dxa"/>
+              <w:right w:w="0" w:type="dxa"/>
+            </w:tcMar>
+            <w:vAlign w:val="center"/>
+          </w:tcPr>
+          <w:p>
+            <w:pPr>
+              <w:pStyle w:val="Normal"/>
+              <w:jc w:val="left"/>
+              <w:pBdr>
+                <w:bottom w:val="none" w:sz="0" w:space="0" w:color="000000"/>
+                <w:top w:val="none" w:sz="0" w:space="0" w:color="000000"/>
+                <w:left w:val="none" w:sz="0" w:space="0" w:color="000000"/>
+                <w:right w:val="none" w:sz="0" w:space="0" w:color="000000"/>
+              </w:pBdr>
+              <w:spacing w:after="100" w:before="100" w:line="240"/>
+              <w:ind w:left="100" w:right="100" w:firstLine="0" w:firstLineChars="0"/>
+              <w:rPr>
+                <w:rFonts w:ascii="Times New Roman" w:hAnsi="Times New Roman" w:eastAsia="Times New Roman" w:cs="Times New Roman"/>
+                <w:i w:val="false"/>
+                <w:b w:val="false"/>
+                <w:u w:val="none"/>
+                <w:strike w:val="false"/>
+                <w:sz w:val="18"/>
+                <w:szCs w:val="18"/>
+                <w:color w:val="000000"/>
+              </w:rPr>
+            </w:pPr>
+            <w:r>
+              <w:rPr>
+                <w:rFonts w:ascii="Times New Roman" w:hAnsi="Times New Roman" w:eastAsia="Times New Roman" w:cs="Times New Roman"/>
+                <w:i w:val="false"/>
+                <w:b w:val="false"/>
+                <w:u w:val="none"/>
+                <w:strike w:val="false"/>
+                <w:sz w:val="18"/>
+                <w:szCs w:val="18"/>
+                <w:color w:val="000000"/>
+              </w:rPr>
+              <w:t xml:space="preserve">0.005</w:t>
             </w:r>
           </w:p>
         </w:tc>
@@ -3715,282 +3715,282 @@
                 <w:szCs w:val="18"/>
                 <w:color w:val="000000"/>
               </w:rPr>
+              <w:t xml:space="preserve">Sex</w:t>
+            </w:r>
+          </w:p>
+        </w:tc>
+        <w:tc>
+          <w:tcPr>
+            <w:tcBorders>
+              <w:bottom w:val="none" w:sz="0" w:space="0" w:color="000000"/>
+              <w:top w:val="none" w:sz="0" w:space="0" w:color="000000"/>
+              <w:left w:val="none" w:sz="0" w:space="0" w:color="000000"/>
+              <w:right w:val="none" w:sz="0" w:space="0" w:color="000000"/>
+            </w:tcBorders>
+            <w:shd w:val="clear" w:color="auto" w:fill="FFFFFF"/>
+            <w:tcMar>
+              <w:top w:w="0" w:type="dxa"/>
+              <w:bottom w:w="0" w:type="dxa"/>
+              <w:left w:w="0" w:type="dxa"/>
+              <w:right w:w="0" w:type="dxa"/>
+            </w:tcMar>
+            <w:vAlign w:val="center"/>
+          </w:tcPr>
+          <w:p>
+            <w:pPr>
+              <w:pStyle w:val="Normal"/>
+              <w:jc w:val="left"/>
+              <w:pBdr>
+                <w:bottom w:val="none" w:sz="0" w:space="0" w:color="000000"/>
+                <w:top w:val="none" w:sz="0" w:space="0" w:color="000000"/>
+                <w:left w:val="none" w:sz="0" w:space="0" w:color="000000"/>
+                <w:right w:val="none" w:sz="0" w:space="0" w:color="000000"/>
+              </w:pBdr>
+              <w:spacing w:after="100" w:before="100" w:line="240"/>
+              <w:ind w:left="100" w:right="100" w:firstLine="0" w:firstLineChars="0"/>
+              <w:rPr>
+                <w:rFonts w:ascii="Times New Roman" w:hAnsi="Times New Roman" w:eastAsia="Times New Roman" w:cs="Times New Roman"/>
+                <w:i w:val="false"/>
+                <w:b w:val="false"/>
+                <w:u w:val="none"/>
+                <w:strike w:val="false"/>
+                <w:sz w:val="18"/>
+                <w:szCs w:val="18"/>
+                <w:color w:val="000000"/>
+              </w:rPr>
+            </w:pPr>
+            <w:r>
+              <w:rPr>
+                <w:rFonts w:ascii="Times New Roman" w:hAnsi="Times New Roman" w:eastAsia="Times New Roman" w:cs="Times New Roman"/>
+                <w:i w:val="false"/>
+                <w:b w:val="false"/>
+                <w:u w:val="none"/>
+                <w:strike w:val="false"/>
+                <w:sz w:val="18"/>
+                <w:szCs w:val="18"/>
+                <w:color w:val="000000"/>
+              </w:rPr>
+              <w:t xml:space="preserve">Male (ref)</w:t>
+            </w:r>
+          </w:p>
+        </w:tc>
+        <w:tc>
+          <w:tcPr>
+            <w:tcBorders>
+              <w:bottom w:val="none" w:sz="0" w:space="0" w:color="000000"/>
+              <w:top w:val="none" w:sz="0" w:space="0" w:color="000000"/>
+              <w:left w:val="none" w:sz="0" w:space="0" w:color="000000"/>
+              <w:right w:val="none" w:sz="0" w:space="0" w:color="000000"/>
+            </w:tcBorders>
+            <w:shd w:val="clear" w:color="auto" w:fill="FFFFFF"/>
+            <w:tcMar>
+              <w:top w:w="0" w:type="dxa"/>
+              <w:bottom w:w="0" w:type="dxa"/>
+              <w:left w:w="0" w:type="dxa"/>
+              <w:right w:w="0" w:type="dxa"/>
+            </w:tcMar>
+            <w:vAlign w:val="center"/>
+          </w:tcPr>
+          <w:p>
+            <w:pPr>
+              <w:pStyle w:val="Normal"/>
+              <w:jc w:val="right"/>
+              <w:pBdr>
+                <w:bottom w:val="none" w:sz="0" w:space="0" w:color="000000"/>
+                <w:top w:val="none" w:sz="0" w:space="0" w:color="000000"/>
+                <w:left w:val="none" w:sz="0" w:space="0" w:color="000000"/>
+                <w:right w:val="none" w:sz="0" w:space="0" w:color="000000"/>
+              </w:pBdr>
+              <w:spacing w:after="100" w:before="100" w:line="240"/>
+              <w:ind w:left="100" w:right="100" w:firstLine="0" w:firstLineChars="0"/>
+              <w:rPr>
+                <w:rFonts w:ascii="Times New Roman" w:hAnsi="Times New Roman" w:eastAsia="Times New Roman" w:cs="Times New Roman"/>
+                <w:i w:val="false"/>
+                <w:b w:val="false"/>
+                <w:u w:val="none"/>
+                <w:strike w:val="false"/>
+                <w:sz w:val="18"/>
+                <w:szCs w:val="18"/>
+                <w:color w:val="000000"/>
+              </w:rPr>
+            </w:pPr>
+            <w:r>
+              <w:rPr>
+                <w:rFonts w:ascii="Times New Roman" w:hAnsi="Times New Roman" w:eastAsia="Times New Roman" w:cs="Times New Roman"/>
+                <w:i w:val="false"/>
+                <w:b w:val="false"/>
+                <w:u w:val="none"/>
+                <w:strike w:val="false"/>
+                <w:sz w:val="18"/>
+                <w:szCs w:val="18"/>
+                <w:color w:val="000000"/>
+              </w:rPr>
+              <w:t xml:space="preserve">249</w:t>
+            </w:r>
+          </w:p>
+        </w:tc>
+        <w:tc>
+          <w:tcPr>
+            <w:tcBorders>
+              <w:bottom w:val="none" w:sz="0" w:space="0" w:color="000000"/>
+              <w:top w:val="none" w:sz="0" w:space="0" w:color="000000"/>
+              <w:left w:val="none" w:sz="0" w:space="0" w:color="000000"/>
+              <w:right w:val="none" w:sz="0" w:space="0" w:color="000000"/>
+            </w:tcBorders>
+            <w:shd w:val="clear" w:color="auto" w:fill="FFFFFF"/>
+            <w:tcMar>
+              <w:top w:w="0" w:type="dxa"/>
+              <w:bottom w:w="0" w:type="dxa"/>
+              <w:left w:w="0" w:type="dxa"/>
+              <w:right w:w="0" w:type="dxa"/>
+            </w:tcMar>
+            <w:vAlign w:val="center"/>
+          </w:tcPr>
+          <w:p>
+            <w:pPr>
+              <w:pStyle w:val="Normal"/>
+              <w:jc w:val="right"/>
+              <w:pBdr>
+                <w:bottom w:val="none" w:sz="0" w:space="0" w:color="000000"/>
+                <w:top w:val="none" w:sz="0" w:space="0" w:color="000000"/>
+                <w:left w:val="none" w:sz="0" w:space="0" w:color="000000"/>
+                <w:right w:val="none" w:sz="0" w:space="0" w:color="000000"/>
+              </w:pBdr>
+              <w:spacing w:after="100" w:before="100" w:line="240"/>
+              <w:ind w:left="100" w:right="100" w:firstLine="0" w:firstLineChars="0"/>
+              <w:rPr>
+                <w:rFonts w:ascii="Times New Roman" w:hAnsi="Times New Roman" w:eastAsia="Times New Roman" w:cs="Times New Roman"/>
+                <w:i w:val="false"/>
+                <w:b w:val="false"/>
+                <w:u w:val="none"/>
+                <w:strike w:val="false"/>
+                <w:sz w:val="18"/>
+                <w:szCs w:val="18"/>
+                <w:color w:val="000000"/>
+              </w:rPr>
+            </w:pPr>
+            <w:r>
+              <w:rPr>
+                <w:rFonts w:ascii="Times New Roman" w:hAnsi="Times New Roman" w:eastAsia="Times New Roman" w:cs="Times New Roman"/>
+                <w:i w:val="false"/>
+                <w:b w:val="false"/>
+                <w:u w:val="none"/>
+                <w:strike w:val="false"/>
+                <w:sz w:val="18"/>
+                <w:szCs w:val="18"/>
+                <w:color w:val="000000"/>
+              </w:rPr>
+              <w:t xml:space="preserve">92</w:t>
+            </w:r>
+          </w:p>
+        </w:tc>
+        <w:tc>
+          <w:tcPr>
+            <w:tcBorders>
+              <w:bottom w:val="none" w:sz="0" w:space="0" w:color="000000"/>
+              <w:top w:val="none" w:sz="0" w:space="0" w:color="000000"/>
+              <w:left w:val="none" w:sz="0" w:space="0" w:color="000000"/>
+              <w:right w:val="none" w:sz="0" w:space="0" w:color="000000"/>
+            </w:tcBorders>
+            <w:shd w:val="clear" w:color="auto" w:fill="FFFFFF"/>
+            <w:tcMar>
+              <w:top w:w="0" w:type="dxa"/>
+              <w:bottom w:w="0" w:type="dxa"/>
+              <w:left w:w="0" w:type="dxa"/>
+              <w:right w:w="0" w:type="dxa"/>
+            </w:tcMar>
+            <w:vAlign w:val="center"/>
+          </w:tcPr>
+          <w:p>
+            <w:pPr>
+              <w:pStyle w:val="Normal"/>
+              <w:jc w:val="left"/>
+              <w:pBdr>
+                <w:bottom w:val="none" w:sz="0" w:space="0" w:color="000000"/>
+                <w:top w:val="none" w:sz="0" w:space="0" w:color="000000"/>
+                <w:left w:val="none" w:sz="0" w:space="0" w:color="000000"/>
+                <w:right w:val="none" w:sz="0" w:space="0" w:color="000000"/>
+              </w:pBdr>
+              <w:spacing w:after="100" w:before="100" w:line="240"/>
+              <w:ind w:left="100" w:right="100" w:firstLine="0" w:firstLineChars="0"/>
+              <w:rPr>
+                <w:rFonts w:ascii="Times New Roman" w:hAnsi="Times New Roman" w:eastAsia="Times New Roman" w:cs="Times New Roman"/>
+                <w:i w:val="false"/>
+                <w:b w:val="false"/>
+                <w:u w:val="none"/>
+                <w:strike w:val="false"/>
+                <w:sz w:val="18"/>
+                <w:szCs w:val="18"/>
+                <w:color w:val="000000"/>
+              </w:rPr>
+            </w:pPr>
+            <w:r>
+              <w:rPr>
+                <w:rFonts w:ascii="Times New Roman" w:hAnsi="Times New Roman" w:eastAsia="Times New Roman" w:cs="Times New Roman"/>
+                <w:i w:val="false"/>
+                <w:b w:val="false"/>
+                <w:u w:val="none"/>
+                <w:strike w:val="false"/>
+                <w:sz w:val="18"/>
+                <w:szCs w:val="18"/>
+                <w:color w:val="000000"/>
+              </w:rPr>
+              <w:t xml:space="preserve">Reference</w:t>
+            </w:r>
+          </w:p>
+        </w:tc>
+        <w:tc>
+          <w:tcPr>
+            <w:tcBorders>
+              <w:bottom w:val="none" w:sz="0" w:space="0" w:color="000000"/>
+              <w:top w:val="none" w:sz="0" w:space="0" w:color="000000"/>
+              <w:left w:val="none" w:sz="0" w:space="0" w:color="000000"/>
+              <w:right w:val="none" w:sz="0" w:space="0" w:color="000000"/>
+            </w:tcBorders>
+            <w:shd w:val="clear" w:color="auto" w:fill="FFFFFF"/>
+            <w:tcMar>
+              <w:top w:w="0" w:type="dxa"/>
+              <w:bottom w:w="0" w:type="dxa"/>
+              <w:left w:w="0" w:type="dxa"/>
+              <w:right w:w="0" w:type="dxa"/>
+            </w:tcMar>
+            <w:vAlign w:val="center"/>
+          </w:tcPr>
+          <w:p>
+            <w:pPr>
+              <w:pStyle w:val="Normal"/>
+              <w:jc w:val="left"/>
+              <w:pBdr>
+                <w:bottom w:val="none" w:sz="0" w:space="0" w:color="000000"/>
+                <w:top w:val="none" w:sz="0" w:space="0" w:color="000000"/>
+                <w:left w:val="none" w:sz="0" w:space="0" w:color="000000"/>
+                <w:right w:val="none" w:sz="0" w:space="0" w:color="000000"/>
+              </w:pBdr>
+              <w:spacing w:after="100" w:before="100" w:line="240"/>
+              <w:ind w:left="100" w:right="100" w:firstLine="0" w:firstLineChars="0"/>
+              <w:rPr>
+                <w:rFonts w:ascii="Times New Roman" w:hAnsi="Times New Roman" w:eastAsia="Times New Roman" w:cs="Times New Roman"/>
+                <w:i w:val="false"/>
+                <w:b w:val="false"/>
+                <w:u w:val="none"/>
+                <w:strike w:val="false"/>
+                <w:sz w:val="18"/>
+                <w:szCs w:val="18"/>
+                <w:color w:val="000000"/>
+              </w:rPr>
+            </w:pPr>
+            <w:r>
+              <w:rPr>
+                <w:rFonts w:ascii="Times New Roman" w:hAnsi="Times New Roman" w:eastAsia="Times New Roman" w:cs="Times New Roman"/>
+                <w:i w:val="false"/>
+                <w:b w:val="false"/>
+                <w:u w:val="none"/>
+                <w:strike w:val="false"/>
+                <w:sz w:val="18"/>
+                <w:szCs w:val="18"/>
+                <w:color w:val="000000"/>
+              </w:rPr>
               <w:t xml:space="preserve"/>
-            </w:r>
-          </w:p>
-        </w:tc>
-        <w:tc>
-          <w:tcPr>
-            <w:tcBorders>
-              <w:bottom w:val="none" w:sz="0" w:space="0" w:color="000000"/>
-              <w:top w:val="none" w:sz="0" w:space="0" w:color="000000"/>
-              <w:left w:val="none" w:sz="0" w:space="0" w:color="000000"/>
-              <w:right w:val="none" w:sz="0" w:space="0" w:color="000000"/>
-            </w:tcBorders>
-            <w:shd w:val="clear" w:color="auto" w:fill="FFFFFF"/>
-            <w:tcMar>
-              <w:top w:w="0" w:type="dxa"/>
-              <w:bottom w:w="0" w:type="dxa"/>
-              <w:left w:w="0" w:type="dxa"/>
-              <w:right w:w="0" w:type="dxa"/>
-            </w:tcMar>
-            <w:vAlign w:val="center"/>
-          </w:tcPr>
-          <w:p>
-            <w:pPr>
-              <w:pStyle w:val="Normal"/>
-              <w:jc w:val="left"/>
-              <w:pBdr>
-                <w:bottom w:val="none" w:sz="0" w:space="0" w:color="000000"/>
-                <w:top w:val="none" w:sz="0" w:space="0" w:color="000000"/>
-                <w:left w:val="none" w:sz="0" w:space="0" w:color="000000"/>
-                <w:right w:val="none" w:sz="0" w:space="0" w:color="000000"/>
-              </w:pBdr>
-              <w:spacing w:after="100" w:before="100" w:line="240"/>
-              <w:ind w:left="100" w:right="100" w:firstLine="0" w:firstLineChars="0"/>
-              <w:rPr>
-                <w:rFonts w:ascii="Times New Roman" w:hAnsi="Times New Roman" w:eastAsia="Times New Roman" w:cs="Times New Roman"/>
-                <w:i w:val="false"/>
-                <w:b w:val="false"/>
-                <w:u w:val="none"/>
-                <w:strike w:val="false"/>
-                <w:sz w:val="18"/>
-                <w:szCs w:val="18"/>
-                <w:color w:val="000000"/>
-              </w:rPr>
-            </w:pPr>
-            <w:r>
-              <w:rPr>
-                <w:rFonts w:ascii="Times New Roman" w:hAnsi="Times New Roman" w:eastAsia="Times New Roman" w:cs="Times New Roman"/>
-                <w:i w:val="false"/>
-                <w:b w:val="false"/>
-                <w:u w:val="none"/>
-                <w:strike w:val="false"/>
-                <w:sz w:val="18"/>
-                <w:szCs w:val="18"/>
-                <w:color w:val="000000"/>
-              </w:rPr>
-              <w:t xml:space="preserve">Female</w:t>
-            </w:r>
-          </w:p>
-        </w:tc>
-        <w:tc>
-          <w:tcPr>
-            <w:tcBorders>
-              <w:bottom w:val="none" w:sz="0" w:space="0" w:color="000000"/>
-              <w:top w:val="none" w:sz="0" w:space="0" w:color="000000"/>
-              <w:left w:val="none" w:sz="0" w:space="0" w:color="000000"/>
-              <w:right w:val="none" w:sz="0" w:space="0" w:color="000000"/>
-            </w:tcBorders>
-            <w:shd w:val="clear" w:color="auto" w:fill="FFFFFF"/>
-            <w:tcMar>
-              <w:top w:w="0" w:type="dxa"/>
-              <w:bottom w:w="0" w:type="dxa"/>
-              <w:left w:w="0" w:type="dxa"/>
-              <w:right w:w="0" w:type="dxa"/>
-            </w:tcMar>
-            <w:vAlign w:val="center"/>
-          </w:tcPr>
-          <w:p>
-            <w:pPr>
-              <w:pStyle w:val="Normal"/>
-              <w:jc w:val="right"/>
-              <w:pBdr>
-                <w:bottom w:val="none" w:sz="0" w:space="0" w:color="000000"/>
-                <w:top w:val="none" w:sz="0" w:space="0" w:color="000000"/>
-                <w:left w:val="none" w:sz="0" w:space="0" w:color="000000"/>
-                <w:right w:val="none" w:sz="0" w:space="0" w:color="000000"/>
-              </w:pBdr>
-              <w:spacing w:after="100" w:before="100" w:line="240"/>
-              <w:ind w:left="100" w:right="100" w:firstLine="0" w:firstLineChars="0"/>
-              <w:rPr>
-                <w:rFonts w:ascii="Times New Roman" w:hAnsi="Times New Roman" w:eastAsia="Times New Roman" w:cs="Times New Roman"/>
-                <w:i w:val="false"/>
-                <w:b w:val="false"/>
-                <w:u w:val="none"/>
-                <w:strike w:val="false"/>
-                <w:sz w:val="18"/>
-                <w:szCs w:val="18"/>
-                <w:color w:val="000000"/>
-              </w:rPr>
-            </w:pPr>
-            <w:r>
-              <w:rPr>
-                <w:rFonts w:ascii="Times New Roman" w:hAnsi="Times New Roman" w:eastAsia="Times New Roman" w:cs="Times New Roman"/>
-                <w:i w:val="false"/>
-                <w:b w:val="false"/>
-                <w:u w:val="none"/>
-                <w:strike w:val="false"/>
-                <w:sz w:val="18"/>
-                <w:szCs w:val="18"/>
-                <w:color w:val="000000"/>
-              </w:rPr>
-              <w:t xml:space="preserve">191</w:t>
-            </w:r>
-          </w:p>
-        </w:tc>
-        <w:tc>
-          <w:tcPr>
-            <w:tcBorders>
-              <w:bottom w:val="none" w:sz="0" w:space="0" w:color="000000"/>
-              <w:top w:val="none" w:sz="0" w:space="0" w:color="000000"/>
-              <w:left w:val="none" w:sz="0" w:space="0" w:color="000000"/>
-              <w:right w:val="none" w:sz="0" w:space="0" w:color="000000"/>
-            </w:tcBorders>
-            <w:shd w:val="clear" w:color="auto" w:fill="FFFFFF"/>
-            <w:tcMar>
-              <w:top w:w="0" w:type="dxa"/>
-              <w:bottom w:w="0" w:type="dxa"/>
-              <w:left w:w="0" w:type="dxa"/>
-              <w:right w:w="0" w:type="dxa"/>
-            </w:tcMar>
-            <w:vAlign w:val="center"/>
-          </w:tcPr>
-          <w:p>
-            <w:pPr>
-              <w:pStyle w:val="Normal"/>
-              <w:jc w:val="right"/>
-              <w:pBdr>
-                <w:bottom w:val="none" w:sz="0" w:space="0" w:color="000000"/>
-                <w:top w:val="none" w:sz="0" w:space="0" w:color="000000"/>
-                <w:left w:val="none" w:sz="0" w:space="0" w:color="000000"/>
-                <w:right w:val="none" w:sz="0" w:space="0" w:color="000000"/>
-              </w:pBdr>
-              <w:spacing w:after="100" w:before="100" w:line="240"/>
-              <w:ind w:left="100" w:right="100" w:firstLine="0" w:firstLineChars="0"/>
-              <w:rPr>
-                <w:rFonts w:ascii="Times New Roman" w:hAnsi="Times New Roman" w:eastAsia="Times New Roman" w:cs="Times New Roman"/>
-                <w:i w:val="false"/>
-                <w:b w:val="false"/>
-                <w:u w:val="none"/>
-                <w:strike w:val="false"/>
-                <w:sz w:val="18"/>
-                <w:szCs w:val="18"/>
-                <w:color w:val="000000"/>
-              </w:rPr>
-            </w:pPr>
-            <w:r>
-              <w:rPr>
-                <w:rFonts w:ascii="Times New Roman" w:hAnsi="Times New Roman" w:eastAsia="Times New Roman" w:cs="Times New Roman"/>
-                <w:i w:val="false"/>
-                <w:b w:val="false"/>
-                <w:u w:val="none"/>
-                <w:strike w:val="false"/>
-                <w:sz w:val="18"/>
-                <w:szCs w:val="18"/>
-                <w:color w:val="000000"/>
-              </w:rPr>
-              <w:t xml:space="preserve">65</w:t>
-            </w:r>
-          </w:p>
-        </w:tc>
-        <w:tc>
-          <w:tcPr>
-            <w:tcBorders>
-              <w:bottom w:val="none" w:sz="0" w:space="0" w:color="000000"/>
-              <w:top w:val="none" w:sz="0" w:space="0" w:color="000000"/>
-              <w:left w:val="none" w:sz="0" w:space="0" w:color="000000"/>
-              <w:right w:val="none" w:sz="0" w:space="0" w:color="000000"/>
-            </w:tcBorders>
-            <w:shd w:val="clear" w:color="auto" w:fill="FFFFFF"/>
-            <w:tcMar>
-              <w:top w:w="0" w:type="dxa"/>
-              <w:bottom w:w="0" w:type="dxa"/>
-              <w:left w:w="0" w:type="dxa"/>
-              <w:right w:w="0" w:type="dxa"/>
-            </w:tcMar>
-            <w:vAlign w:val="center"/>
-          </w:tcPr>
-          <w:p>
-            <w:pPr>
-              <w:pStyle w:val="Normal"/>
-              <w:jc w:val="left"/>
-              <w:pBdr>
-                <w:bottom w:val="none" w:sz="0" w:space="0" w:color="000000"/>
-                <w:top w:val="none" w:sz="0" w:space="0" w:color="000000"/>
-                <w:left w:val="none" w:sz="0" w:space="0" w:color="000000"/>
-                <w:right w:val="none" w:sz="0" w:space="0" w:color="000000"/>
-              </w:pBdr>
-              <w:spacing w:after="100" w:before="100" w:line="240"/>
-              <w:ind w:left="100" w:right="100" w:firstLine="0" w:firstLineChars="0"/>
-              <w:rPr>
-                <w:rFonts w:ascii="Times New Roman" w:hAnsi="Times New Roman" w:eastAsia="Times New Roman" w:cs="Times New Roman"/>
-                <w:i w:val="false"/>
-                <w:b w:val="false"/>
-                <w:u w:val="none"/>
-                <w:strike w:val="false"/>
-                <w:sz w:val="18"/>
-                <w:szCs w:val="18"/>
-                <w:color w:val="000000"/>
-              </w:rPr>
-            </w:pPr>
-            <w:r>
-              <w:rPr>
-                <w:rFonts w:ascii="Times New Roman" w:hAnsi="Times New Roman" w:eastAsia="Times New Roman" w:cs="Times New Roman"/>
-                <w:i w:val="false"/>
-                <w:b w:val="false"/>
-                <w:u w:val="none"/>
-                <w:strike w:val="false"/>
-                <w:sz w:val="18"/>
-                <w:szCs w:val="18"/>
-                <w:color w:val="000000"/>
-              </w:rPr>
-              <w:t xml:space="preserve">0.86 (0.62–1.18)</w:t>
-            </w:r>
-          </w:p>
-        </w:tc>
-        <w:tc>
-          <w:tcPr>
-            <w:tcBorders>
-              <w:bottom w:val="none" w:sz="0" w:space="0" w:color="000000"/>
-              <w:top w:val="none" w:sz="0" w:space="0" w:color="000000"/>
-              <w:left w:val="none" w:sz="0" w:space="0" w:color="000000"/>
-              <w:right w:val="none" w:sz="0" w:space="0" w:color="000000"/>
-            </w:tcBorders>
-            <w:shd w:val="clear" w:color="auto" w:fill="FFFFFF"/>
-            <w:tcMar>
-              <w:top w:w="0" w:type="dxa"/>
-              <w:bottom w:w="0" w:type="dxa"/>
-              <w:left w:w="0" w:type="dxa"/>
-              <w:right w:w="0" w:type="dxa"/>
-            </w:tcMar>
-            <w:vAlign w:val="center"/>
-          </w:tcPr>
-          <w:p>
-            <w:pPr>
-              <w:pStyle w:val="Normal"/>
-              <w:jc w:val="left"/>
-              <w:pBdr>
-                <w:bottom w:val="none" w:sz="0" w:space="0" w:color="000000"/>
-                <w:top w:val="none" w:sz="0" w:space="0" w:color="000000"/>
-                <w:left w:val="none" w:sz="0" w:space="0" w:color="000000"/>
-                <w:right w:val="none" w:sz="0" w:space="0" w:color="000000"/>
-              </w:pBdr>
-              <w:spacing w:after="100" w:before="100" w:line="240"/>
-              <w:ind w:left="100" w:right="100" w:firstLine="0" w:firstLineChars="0"/>
-              <w:rPr>
-                <w:rFonts w:ascii="Times New Roman" w:hAnsi="Times New Roman" w:eastAsia="Times New Roman" w:cs="Times New Roman"/>
-                <w:i w:val="false"/>
-                <w:b w:val="false"/>
-                <w:u w:val="none"/>
-                <w:strike w:val="false"/>
-                <w:sz w:val="18"/>
-                <w:szCs w:val="18"/>
-                <w:color w:val="000000"/>
-              </w:rPr>
-            </w:pPr>
-            <w:r>
-              <w:rPr>
-                <w:rFonts w:ascii="Times New Roman" w:hAnsi="Times New Roman" w:eastAsia="Times New Roman" w:cs="Times New Roman"/>
-                <w:i w:val="false"/>
-                <w:b w:val="false"/>
-                <w:u w:val="none"/>
-                <w:strike w:val="false"/>
-                <w:sz w:val="18"/>
-                <w:szCs w:val="18"/>
-                <w:color w:val="000000"/>
-              </w:rPr>
-              <w:t xml:space="preserve">0.349</w:t>
             </w:r>
           </w:p>
         </w:tc>
@@ -4160,6 +4160,451 @@
                 <w:szCs w:val="18"/>
                 <w:color w:val="000000"/>
               </w:rPr>
+              <w:t xml:space="preserve"/>
+            </w:r>
+          </w:p>
+        </w:tc>
+        <w:tc>
+          <w:tcPr>
+            <w:tcBorders>
+              <w:bottom w:val="none" w:sz="0" w:space="0" w:color="000000"/>
+              <w:top w:val="none" w:sz="0" w:space="0" w:color="000000"/>
+              <w:left w:val="none" w:sz="0" w:space="0" w:color="000000"/>
+              <w:right w:val="none" w:sz="0" w:space="0" w:color="000000"/>
+            </w:tcBorders>
+            <w:shd w:val="clear" w:color="auto" w:fill="FFFFFF"/>
+            <w:tcMar>
+              <w:top w:w="0" w:type="dxa"/>
+              <w:bottom w:w="0" w:type="dxa"/>
+              <w:left w:w="0" w:type="dxa"/>
+              <w:right w:w="0" w:type="dxa"/>
+            </w:tcMar>
+            <w:vAlign w:val="center"/>
+          </w:tcPr>
+          <w:p>
+            <w:pPr>
+              <w:pStyle w:val="Normal"/>
+              <w:jc w:val="left"/>
+              <w:pBdr>
+                <w:bottom w:val="none" w:sz="0" w:space="0" w:color="000000"/>
+                <w:top w:val="none" w:sz="0" w:space="0" w:color="000000"/>
+                <w:left w:val="none" w:sz="0" w:space="0" w:color="000000"/>
+                <w:right w:val="none" w:sz="0" w:space="0" w:color="000000"/>
+              </w:pBdr>
+              <w:spacing w:after="100" w:before="100" w:line="240"/>
+              <w:ind w:left="100" w:right="100" w:firstLine="0" w:firstLineChars="0"/>
+              <w:rPr>
+                <w:rFonts w:ascii="Times New Roman" w:hAnsi="Times New Roman" w:eastAsia="Times New Roman" w:cs="Times New Roman"/>
+                <w:i w:val="false"/>
+                <w:b w:val="false"/>
+                <w:u w:val="none"/>
+                <w:strike w:val="false"/>
+                <w:sz w:val="18"/>
+                <w:szCs w:val="18"/>
+                <w:color w:val="000000"/>
+              </w:rPr>
+            </w:pPr>
+            <w:r>
+              <w:rPr>
+                <w:rFonts w:ascii="Times New Roman" w:hAnsi="Times New Roman" w:eastAsia="Times New Roman" w:cs="Times New Roman"/>
+                <w:i w:val="false"/>
+                <w:b w:val="false"/>
+                <w:u w:val="none"/>
+                <w:strike w:val="false"/>
+                <w:sz w:val="18"/>
+                <w:szCs w:val="18"/>
+                <w:color w:val="000000"/>
+              </w:rPr>
+              <w:t xml:space="preserve">Female</w:t>
+            </w:r>
+          </w:p>
+        </w:tc>
+        <w:tc>
+          <w:tcPr>
+            <w:tcBorders>
+              <w:bottom w:val="none" w:sz="0" w:space="0" w:color="000000"/>
+              <w:top w:val="none" w:sz="0" w:space="0" w:color="000000"/>
+              <w:left w:val="none" w:sz="0" w:space="0" w:color="000000"/>
+              <w:right w:val="none" w:sz="0" w:space="0" w:color="000000"/>
+            </w:tcBorders>
+            <w:shd w:val="clear" w:color="auto" w:fill="FFFFFF"/>
+            <w:tcMar>
+              <w:top w:w="0" w:type="dxa"/>
+              <w:bottom w:w="0" w:type="dxa"/>
+              <w:left w:w="0" w:type="dxa"/>
+              <w:right w:w="0" w:type="dxa"/>
+            </w:tcMar>
+            <w:vAlign w:val="center"/>
+          </w:tcPr>
+          <w:p>
+            <w:pPr>
+              <w:pStyle w:val="Normal"/>
+              <w:jc w:val="right"/>
+              <w:pBdr>
+                <w:bottom w:val="none" w:sz="0" w:space="0" w:color="000000"/>
+                <w:top w:val="none" w:sz="0" w:space="0" w:color="000000"/>
+                <w:left w:val="none" w:sz="0" w:space="0" w:color="000000"/>
+                <w:right w:val="none" w:sz="0" w:space="0" w:color="000000"/>
+              </w:pBdr>
+              <w:spacing w:after="100" w:before="100" w:line="240"/>
+              <w:ind w:left="100" w:right="100" w:firstLine="0" w:firstLineChars="0"/>
+              <w:rPr>
+                <w:rFonts w:ascii="Times New Roman" w:hAnsi="Times New Roman" w:eastAsia="Times New Roman" w:cs="Times New Roman"/>
+                <w:i w:val="false"/>
+                <w:b w:val="false"/>
+                <w:u w:val="none"/>
+                <w:strike w:val="false"/>
+                <w:sz w:val="18"/>
+                <w:szCs w:val="18"/>
+                <w:color w:val="000000"/>
+              </w:rPr>
+            </w:pPr>
+            <w:r>
+              <w:rPr>
+                <w:rFonts w:ascii="Times New Roman" w:hAnsi="Times New Roman" w:eastAsia="Times New Roman" w:cs="Times New Roman"/>
+                <w:i w:val="false"/>
+                <w:b w:val="false"/>
+                <w:u w:val="none"/>
+                <w:strike w:val="false"/>
+                <w:sz w:val="18"/>
+                <w:szCs w:val="18"/>
+                <w:color w:val="000000"/>
+              </w:rPr>
+              <w:t xml:space="preserve">191</w:t>
+            </w:r>
+          </w:p>
+        </w:tc>
+        <w:tc>
+          <w:tcPr>
+            <w:tcBorders>
+              <w:bottom w:val="none" w:sz="0" w:space="0" w:color="000000"/>
+              <w:top w:val="none" w:sz="0" w:space="0" w:color="000000"/>
+              <w:left w:val="none" w:sz="0" w:space="0" w:color="000000"/>
+              <w:right w:val="none" w:sz="0" w:space="0" w:color="000000"/>
+            </w:tcBorders>
+            <w:shd w:val="clear" w:color="auto" w:fill="FFFFFF"/>
+            <w:tcMar>
+              <w:top w:w="0" w:type="dxa"/>
+              <w:bottom w:w="0" w:type="dxa"/>
+              <w:left w:w="0" w:type="dxa"/>
+              <w:right w:w="0" w:type="dxa"/>
+            </w:tcMar>
+            <w:vAlign w:val="center"/>
+          </w:tcPr>
+          <w:p>
+            <w:pPr>
+              <w:pStyle w:val="Normal"/>
+              <w:jc w:val="right"/>
+              <w:pBdr>
+                <w:bottom w:val="none" w:sz="0" w:space="0" w:color="000000"/>
+                <w:top w:val="none" w:sz="0" w:space="0" w:color="000000"/>
+                <w:left w:val="none" w:sz="0" w:space="0" w:color="000000"/>
+                <w:right w:val="none" w:sz="0" w:space="0" w:color="000000"/>
+              </w:pBdr>
+              <w:spacing w:after="100" w:before="100" w:line="240"/>
+              <w:ind w:left="100" w:right="100" w:firstLine="0" w:firstLineChars="0"/>
+              <w:rPr>
+                <w:rFonts w:ascii="Times New Roman" w:hAnsi="Times New Roman" w:eastAsia="Times New Roman" w:cs="Times New Roman"/>
+                <w:i w:val="false"/>
+                <w:b w:val="false"/>
+                <w:u w:val="none"/>
+                <w:strike w:val="false"/>
+                <w:sz w:val="18"/>
+                <w:szCs w:val="18"/>
+                <w:color w:val="000000"/>
+              </w:rPr>
+            </w:pPr>
+            <w:r>
+              <w:rPr>
+                <w:rFonts w:ascii="Times New Roman" w:hAnsi="Times New Roman" w:eastAsia="Times New Roman" w:cs="Times New Roman"/>
+                <w:i w:val="false"/>
+                <w:b w:val="false"/>
+                <w:u w:val="none"/>
+                <w:strike w:val="false"/>
+                <w:sz w:val="18"/>
+                <w:szCs w:val="18"/>
+                <w:color w:val="000000"/>
+              </w:rPr>
+              <w:t xml:space="preserve">65</w:t>
+            </w:r>
+          </w:p>
+        </w:tc>
+        <w:tc>
+          <w:tcPr>
+            <w:tcBorders>
+              <w:bottom w:val="none" w:sz="0" w:space="0" w:color="000000"/>
+              <w:top w:val="none" w:sz="0" w:space="0" w:color="000000"/>
+              <w:left w:val="none" w:sz="0" w:space="0" w:color="000000"/>
+              <w:right w:val="none" w:sz="0" w:space="0" w:color="000000"/>
+            </w:tcBorders>
+            <w:shd w:val="clear" w:color="auto" w:fill="FFFFFF"/>
+            <w:tcMar>
+              <w:top w:w="0" w:type="dxa"/>
+              <w:bottom w:w="0" w:type="dxa"/>
+              <w:left w:w="0" w:type="dxa"/>
+              <w:right w:w="0" w:type="dxa"/>
+            </w:tcMar>
+            <w:vAlign w:val="center"/>
+          </w:tcPr>
+          <w:p>
+            <w:pPr>
+              <w:pStyle w:val="Normal"/>
+              <w:jc w:val="left"/>
+              <w:pBdr>
+                <w:bottom w:val="none" w:sz="0" w:space="0" w:color="000000"/>
+                <w:top w:val="none" w:sz="0" w:space="0" w:color="000000"/>
+                <w:left w:val="none" w:sz="0" w:space="0" w:color="000000"/>
+                <w:right w:val="none" w:sz="0" w:space="0" w:color="000000"/>
+              </w:pBdr>
+              <w:spacing w:after="100" w:before="100" w:line="240"/>
+              <w:ind w:left="100" w:right="100" w:firstLine="0" w:firstLineChars="0"/>
+              <w:rPr>
+                <w:rFonts w:ascii="Times New Roman" w:hAnsi="Times New Roman" w:eastAsia="Times New Roman" w:cs="Times New Roman"/>
+                <w:i w:val="false"/>
+                <w:b w:val="false"/>
+                <w:u w:val="none"/>
+                <w:strike w:val="false"/>
+                <w:sz w:val="18"/>
+                <w:szCs w:val="18"/>
+                <w:color w:val="000000"/>
+              </w:rPr>
+            </w:pPr>
+            <w:r>
+              <w:rPr>
+                <w:rFonts w:ascii="Times New Roman" w:hAnsi="Times New Roman" w:eastAsia="Times New Roman" w:cs="Times New Roman"/>
+                <w:i w:val="false"/>
+                <w:b w:val="false"/>
+                <w:u w:val="none"/>
+                <w:strike w:val="false"/>
+                <w:sz w:val="18"/>
+                <w:szCs w:val="18"/>
+                <w:color w:val="000000"/>
+              </w:rPr>
+              <w:t xml:space="preserve">0.86 (0.62–1.18)</w:t>
+            </w:r>
+          </w:p>
+        </w:tc>
+        <w:tc>
+          <w:tcPr>
+            <w:tcBorders>
+              <w:bottom w:val="none" w:sz="0" w:space="0" w:color="000000"/>
+              <w:top w:val="none" w:sz="0" w:space="0" w:color="000000"/>
+              <w:left w:val="none" w:sz="0" w:space="0" w:color="000000"/>
+              <w:right w:val="none" w:sz="0" w:space="0" w:color="000000"/>
+            </w:tcBorders>
+            <w:shd w:val="clear" w:color="auto" w:fill="FFFFFF"/>
+            <w:tcMar>
+              <w:top w:w="0" w:type="dxa"/>
+              <w:bottom w:w="0" w:type="dxa"/>
+              <w:left w:w="0" w:type="dxa"/>
+              <w:right w:w="0" w:type="dxa"/>
+            </w:tcMar>
+            <w:vAlign w:val="center"/>
+          </w:tcPr>
+          <w:p>
+            <w:pPr>
+              <w:pStyle w:val="Normal"/>
+              <w:jc w:val="left"/>
+              <w:pBdr>
+                <w:bottom w:val="none" w:sz="0" w:space="0" w:color="000000"/>
+                <w:top w:val="none" w:sz="0" w:space="0" w:color="000000"/>
+                <w:left w:val="none" w:sz="0" w:space="0" w:color="000000"/>
+                <w:right w:val="none" w:sz="0" w:space="0" w:color="000000"/>
+              </w:pBdr>
+              <w:spacing w:after="100" w:before="100" w:line="240"/>
+              <w:ind w:left="100" w:right="100" w:firstLine="0" w:firstLineChars="0"/>
+              <w:rPr>
+                <w:rFonts w:ascii="Times New Roman" w:hAnsi="Times New Roman" w:eastAsia="Times New Roman" w:cs="Times New Roman"/>
+                <w:i w:val="false"/>
+                <w:b w:val="false"/>
+                <w:u w:val="none"/>
+                <w:strike w:val="false"/>
+                <w:sz w:val="18"/>
+                <w:szCs w:val="18"/>
+                <w:color w:val="000000"/>
+              </w:rPr>
+            </w:pPr>
+            <w:r>
+              <w:rPr>
+                <w:rFonts w:ascii="Times New Roman" w:hAnsi="Times New Roman" w:eastAsia="Times New Roman" w:cs="Times New Roman"/>
+                <w:i w:val="false"/>
+                <w:b w:val="false"/>
+                <w:u w:val="none"/>
+                <w:strike w:val="false"/>
+                <w:sz w:val="18"/>
+                <w:szCs w:val="18"/>
+                <w:color w:val="000000"/>
+              </w:rPr>
+              <w:t xml:space="preserve">0.353</w:t>
+            </w:r>
+          </w:p>
+        </w:tc>
+        <w:tc>
+          <w:tcPr>
+            <w:tcBorders>
+              <w:bottom w:val="none" w:sz="0" w:space="0" w:color="000000"/>
+              <w:top w:val="none" w:sz="0" w:space="0" w:color="000000"/>
+              <w:left w:val="none" w:sz="0" w:space="0" w:color="000000"/>
+              <w:right w:val="none" w:sz="0" w:space="0" w:color="000000"/>
+            </w:tcBorders>
+            <w:shd w:val="clear" w:color="auto" w:fill="FFFFFF"/>
+            <w:tcMar>
+              <w:top w:w="0" w:type="dxa"/>
+              <w:bottom w:w="0" w:type="dxa"/>
+              <w:left w:w="0" w:type="dxa"/>
+              <w:right w:w="0" w:type="dxa"/>
+            </w:tcMar>
+            <w:vAlign w:val="center"/>
+          </w:tcPr>
+          <w:p>
+            <w:pPr>
+              <w:pStyle w:val="Normal"/>
+              <w:jc w:val="left"/>
+              <w:pBdr>
+                <w:bottom w:val="none" w:sz="0" w:space="0" w:color="000000"/>
+                <w:top w:val="none" w:sz="0" w:space="0" w:color="000000"/>
+                <w:left w:val="none" w:sz="0" w:space="0" w:color="000000"/>
+                <w:right w:val="none" w:sz="0" w:space="0" w:color="000000"/>
+              </w:pBdr>
+              <w:spacing w:after="100" w:before="100" w:line="240"/>
+              <w:ind w:left="100" w:right="100" w:firstLine="0" w:firstLineChars="0"/>
+              <w:rPr>
+                <w:rFonts w:ascii="Times New Roman" w:hAnsi="Times New Roman" w:eastAsia="Times New Roman" w:cs="Times New Roman"/>
+                <w:i w:val="false"/>
+                <w:b w:val="false"/>
+                <w:u w:val="none"/>
+                <w:strike w:val="false"/>
+                <w:sz w:val="18"/>
+                <w:szCs w:val="18"/>
+                <w:color w:val="000000"/>
+              </w:rPr>
+            </w:pPr>
+            <w:r>
+              <w:rPr>
+                <w:rFonts w:ascii="Times New Roman" w:hAnsi="Times New Roman" w:eastAsia="Times New Roman" w:cs="Times New Roman"/>
+                <w:i w:val="false"/>
+                <w:b w:val="false"/>
+                <w:u w:val="none"/>
+                <w:strike w:val="false"/>
+                <w:sz w:val="18"/>
+                <w:szCs w:val="18"/>
+                <w:color w:val="000000"/>
+              </w:rPr>
+              <w:t xml:space="preserve"/>
+            </w:r>
+          </w:p>
+        </w:tc>
+      </w:tr>
+      <w:tr>
+        <w:trPr>
+          <w:trHeight w:val="560" w:hRule="auto"/>
+        </w:trPr>
+        <w:tc>
+          <w:tcPr>
+            <w:tcBorders>
+              <w:bottom w:val="none" w:sz="0" w:space="0" w:color="000000"/>
+              <w:top w:val="none" w:sz="0" w:space="0" w:color="000000"/>
+              <w:left w:val="none" w:sz="0" w:space="0" w:color="000000"/>
+              <w:right w:val="none" w:sz="0" w:space="0" w:color="000000"/>
+            </w:tcBorders>
+            <w:shd w:val="clear" w:color="auto" w:fill="FFFFFF"/>
+            <w:tcMar>
+              <w:top w:w="0" w:type="dxa"/>
+              <w:bottom w:w="0" w:type="dxa"/>
+              <w:left w:w="0" w:type="dxa"/>
+              <w:right w:w="0" w:type="dxa"/>
+            </w:tcMar>
+            <w:vAlign w:val="center"/>
+          </w:tcPr>
+          <w:p>
+            <w:pPr>
+              <w:pStyle w:val="Normal"/>
+              <w:jc w:val="left"/>
+              <w:pBdr>
+                <w:bottom w:val="none" w:sz="0" w:space="0" w:color="000000"/>
+                <w:top w:val="none" w:sz="0" w:space="0" w:color="000000"/>
+                <w:left w:val="none" w:sz="0" w:space="0" w:color="000000"/>
+                <w:right w:val="none" w:sz="0" w:space="0" w:color="000000"/>
+              </w:pBdr>
+              <w:spacing w:after="100" w:before="100" w:line="240"/>
+              <w:ind w:left="100" w:right="100" w:firstLine="0" w:firstLineChars="0"/>
+              <w:rPr>
+                <w:rFonts w:ascii="Times New Roman" w:hAnsi="Times New Roman" w:eastAsia="Times New Roman" w:cs="Times New Roman"/>
+                <w:i w:val="false"/>
+                <w:b w:val="false"/>
+                <w:u w:val="none"/>
+                <w:strike w:val="false"/>
+                <w:sz w:val="18"/>
+                <w:szCs w:val="18"/>
+                <w:color w:val="000000"/>
+              </w:rPr>
+            </w:pPr>
+            <w:r>
+              <w:rPr>
+                <w:rFonts w:ascii="Times New Roman" w:hAnsi="Times New Roman" w:eastAsia="Times New Roman" w:cs="Times New Roman"/>
+                <w:i w:val="false"/>
+                <w:b w:val="false"/>
+                <w:u w:val="none"/>
+                <w:strike w:val="false"/>
+                <w:sz w:val="18"/>
+                <w:szCs w:val="18"/>
+                <w:color w:val="000000"/>
+              </w:rPr>
+              <w:t xml:space="preserve">Multivariable</w:t>
+            </w:r>
+          </w:p>
+        </w:tc>
+        <w:tc>
+          <w:tcPr>
+            <w:tcBorders>
+              <w:bottom w:val="none" w:sz="0" w:space="0" w:color="000000"/>
+              <w:top w:val="none" w:sz="0" w:space="0" w:color="000000"/>
+              <w:left w:val="none" w:sz="0" w:space="0" w:color="000000"/>
+              <w:right w:val="none" w:sz="0" w:space="0" w:color="000000"/>
+            </w:tcBorders>
+            <w:shd w:val="clear" w:color="auto" w:fill="FFFFFF"/>
+            <w:tcMar>
+              <w:top w:w="0" w:type="dxa"/>
+              <w:bottom w:w="0" w:type="dxa"/>
+              <w:left w:w="0" w:type="dxa"/>
+              <w:right w:w="0" w:type="dxa"/>
+            </w:tcMar>
+            <w:vAlign w:val="center"/>
+          </w:tcPr>
+          <w:p>
+            <w:pPr>
+              <w:pStyle w:val="Normal"/>
+              <w:jc w:val="left"/>
+              <w:pBdr>
+                <w:bottom w:val="none" w:sz="0" w:space="0" w:color="000000"/>
+                <w:top w:val="none" w:sz="0" w:space="0" w:color="000000"/>
+                <w:left w:val="none" w:sz="0" w:space="0" w:color="000000"/>
+                <w:right w:val="none" w:sz="0" w:space="0" w:color="000000"/>
+              </w:pBdr>
+              <w:spacing w:after="100" w:before="100" w:line="240"/>
+              <w:ind w:left="100" w:right="100" w:firstLine="0" w:firstLineChars="0"/>
+              <w:rPr>
+                <w:rFonts w:ascii="Times New Roman" w:hAnsi="Times New Roman" w:eastAsia="Times New Roman" w:cs="Times New Roman"/>
+                <w:i w:val="false"/>
+                <w:b w:val="false"/>
+                <w:u w:val="none"/>
+                <w:strike w:val="false"/>
+                <w:sz w:val="18"/>
+                <w:szCs w:val="18"/>
+                <w:color w:val="000000"/>
+              </w:rPr>
+            </w:pPr>
+            <w:r>
+              <w:rPr>
+                <w:rFonts w:ascii="Times New Roman" w:hAnsi="Times New Roman" w:eastAsia="Times New Roman" w:cs="Times New Roman"/>
+                <w:i w:val="false"/>
+                <w:b w:val="false"/>
+                <w:u w:val="none"/>
+                <w:strike w:val="false"/>
+                <w:sz w:val="18"/>
+                <w:szCs w:val="18"/>
+                <w:color w:val="000000"/>
+              </w:rPr>
               <w:t xml:space="preserve">Pathologic stage group</w:t>
             </w:r>
           </w:p>
@@ -4825,7 +5270,7 @@
                 <w:szCs w:val="18"/>
                 <w:color w:val="000000"/>
               </w:rPr>
-              <w:t xml:space="preserve">1.91 (1.38–2.65)</w:t>
+              <w:t xml:space="preserve">1.89 (1.36–2.62)</w:t>
             </w:r>
           </w:p>
         </w:tc>

</xml_diff>